<commit_message>
Update Adhara role to CTO to match LinkedIn
Co-Authored-By: Claude Opus 5.5 (1M context) <noreply@anthropic.com>
</commit_message>
<xml_diff>
--- a/artifacts/resume/public/fernando-rodriguez-resume.docx
+++ b/artifacts/resume/public/fernando-rodriguez-resume.docx
@@ -29,7 +29,7 @@
           <w:sz w:val="21"/>
           <w:szCs w:val="21"/>
         </w:rPr>
-        <w:t xml:space="preserve">Head of Engineering  |  Backend Expert (Go / Java / JS)  |  Blockchain &amp; AI</w:t>
+        <w:t xml:space="preserve">CTO @ Adhara  |  Backend Expert (Go / Java / JS)  |  Blockchain &amp; AI</w:t>
       </w:r>
     </w:p>
     <w:p>
@@ -51,15 +51,15 @@
     </w:p>
     <w:p>
       <w:pPr>
-        <w:spacing w:after="217"/>
-      </w:pPr>
-      <w:r>
-        <w:rPr>
-          <w:rFonts w:ascii="Calibri" w:cs="Calibri" w:eastAsia="Calibri" w:hAnsi="Calibri"/>
-          <w:sz w:val="20"/>
-          <w:szCs w:val="20"/>
-        </w:rPr>
-        <w:t xml:space="preserve">Engineering leader with 14+ years building scalable distributed systems, blockchain platforms, and AI-driven products in fintech and regulated markets. Head of Engineering at Adhara, leading Ethereum-based digital token infrastructure for central banks while driving company-wide AI initiatives from research to production.</w:t>
+        <w:spacing w:after="165"/>
+      </w:pPr>
+      <w:r>
+        <w:rPr>
+          <w:rFonts w:ascii="Calibri" w:cs="Calibri" w:eastAsia="Calibri" w:hAnsi="Calibri"/>
+          <w:sz w:val="20"/>
+          <w:szCs w:val="20"/>
+        </w:rPr>
+        <w:t xml:space="preserve">Engineering leader with 15+ years building scalable distributed systems, blockchain platforms, and AI-driven products in fintech and regulated markets. CTO at Adhara, co-owning technology vision and execution for digital money and settlement infrastructure for central banks and financial institutions, while driving the company's AI strategy from experimentation to production.</w:t>
       </w:r>
     </w:p>
     <w:p>
@@ -67,7 +67,7 @@
         <w:pBdr>
           <w:bottom w:val="single" w:color="000000" w:sz="6" w:space="2"/>
         </w:pBdr>
-        <w:spacing w:after="60" w:before="217"/>
+        <w:spacing w:after="60" w:before="165"/>
       </w:pPr>
       <w:r>
         <w:rPr>
@@ -85,17 +85,17 @@
         <w:tabs>
           <w:tab w:val="right" w:pos="9026"/>
         </w:tabs>
-        <w:spacing w:after="0" w:before="138"/>
-      </w:pPr>
-      <w:r>
-        <w:rPr>
-          <w:rFonts w:ascii="Calibri" w:cs="Calibri" w:eastAsia="Calibri" w:hAnsi="Calibri"/>
-          <w:b/>
-          <w:bCs/>
-          <w:sz w:val="20"/>
-          <w:szCs w:val="20"/>
-        </w:rPr>
-        <w:t xml:space="preserve">Head of Engineering</w:t>
+        <w:spacing w:after="0" w:before="103"/>
+      </w:pPr>
+      <w:r>
+        <w:rPr>
+          <w:rFonts w:ascii="Calibri" w:cs="Calibri" w:eastAsia="Calibri" w:hAnsi="Calibri"/>
+          <w:b/>
+          <w:bCs/>
+          <w:sz w:val="20"/>
+          <w:szCs w:val="20"/>
+        </w:rPr>
+        <w:t xml:space="preserve">CTO</w:t>
       </w:r>
       <w:r>
         <w:rPr>
@@ -125,44 +125,58 @@
     </w:p>
     <w:p>
       <w:pPr>
-        <w:spacing w:after="49" w:before="0"/>
-        <w:ind w:left="160"/>
-      </w:pPr>
-      <w:r>
-        <w:rPr>
-          <w:rFonts w:ascii="Calibri" w:cs="Calibri" w:eastAsia="Calibri" w:hAnsi="Calibri"/>
-          <w:sz w:val="20"/>
-          <w:szCs w:val="20"/>
-        </w:rPr>
-        <w:t xml:space="preserve">• Lead engineering organization across strategy, hiring, and delivery of AI-driven systems and scalable blockchain platforms for central banks and financial institutions.</w:t>
-      </w:r>
-    </w:p>
-    <w:p>
-      <w:pPr>
-        <w:spacing w:after="49" w:before="0"/>
-        <w:ind w:left="160"/>
-      </w:pPr>
-      <w:r>
-        <w:rPr>
-          <w:rFonts w:ascii="Calibri" w:cs="Calibri" w:eastAsia="Calibri" w:hAnsi="Calibri"/>
-          <w:sz w:val="20"/>
-          <w:szCs w:val="20"/>
-        </w:rPr>
-        <w:t xml:space="preserve">• Define engineering processes, architectural standards, and technical strategy; bridge engineering, product, and business stakeholders to ensure sustainable, high-quality delivery.</w:t>
-      </w:r>
-    </w:p>
-    <w:p>
-      <w:pPr>
-        <w:spacing w:after="49" w:before="0"/>
-        <w:ind w:left="160"/>
-      </w:pPr>
-      <w:r>
-        <w:rPr>
-          <w:rFonts w:ascii="Calibri" w:cs="Calibri" w:eastAsia="Calibri" w:hAnsi="Calibri"/>
-          <w:sz w:val="20"/>
-          <w:szCs w:val="20"/>
-        </w:rPr>
-        <w:t xml:space="preserve">• Drive company-wide AI initiatives from research and experimentation through to production-grade systems.</w:t>
+        <w:spacing w:after="32" w:before="0"/>
+        <w:ind w:left="160"/>
+      </w:pPr>
+      <w:r>
+        <w:rPr>
+          <w:rFonts w:ascii="Calibri" w:cs="Calibri" w:eastAsia="Calibri" w:hAnsi="Calibri"/>
+          <w:sz w:val="20"/>
+          <w:szCs w:val="20"/>
+        </w:rPr>
+        <w:t xml:space="preserve">• Co-own company-wide technology strategy and lead the engineering organization, from platform architecture and product engineering to delivery in highly regulated financial environments.</w:t>
+      </w:r>
+    </w:p>
+    <w:p>
+      <w:pPr>
+        <w:spacing w:after="32" w:before="0"/>
+        <w:ind w:left="160"/>
+      </w:pPr>
+      <w:r>
+        <w:rPr>
+          <w:rFonts w:ascii="Calibri" w:cs="Calibri" w:eastAsia="Calibri" w:hAnsi="Calibri"/>
+          <w:sz w:val="20"/>
+          <w:szCs w:val="20"/>
+        </w:rPr>
+        <w:t xml:space="preserve">• Drive Adhara's AI strategy: embedding AI across engineering and shipping AI-enabled capabilities from experimentation to production-grade systems.</w:t>
+      </w:r>
+    </w:p>
+    <w:p>
+      <w:pPr>
+        <w:spacing w:after="32" w:before="0"/>
+        <w:ind w:left="160"/>
+      </w:pPr>
+      <w:r>
+        <w:rPr>
+          <w:rFonts w:ascii="Calibri" w:cs="Calibri" w:eastAsia="Calibri" w:hAnsi="Calibri"/>
+          <w:sz w:val="20"/>
+          <w:szCs w:val="20"/>
+        </w:rPr>
+        <w:t xml:space="preserve">• Lead the modernization of the core platform for scalable, resilient, and secure settlement and tokenized money infrastructure; stay hands-on in architecture, Go backends, and Ethereum/DLT design.</w:t>
+      </w:r>
+    </w:p>
+    <w:p>
+      <w:pPr>
+        <w:spacing w:after="32" w:before="0"/>
+        <w:ind w:left="160"/>
+      </w:pPr>
+      <w:r>
+        <w:rPr>
+          <w:rFonts w:ascii="Calibri" w:cs="Calibri" w:eastAsia="Calibri" w:hAnsi="Calibri"/>
+          <w:sz w:val="20"/>
+          <w:szCs w:val="20"/>
+        </w:rPr>
+        <w:t xml:space="preserve">• Own the technical narrative with customers, partners, and regulators (due diligence, security posture, architecture) and partner with the CEO and business leadership to align technology investment with strategy.</w:t>
       </w:r>
     </w:p>
     <w:p>
@@ -170,7 +184,7 @@
         <w:tabs>
           <w:tab w:val="right" w:pos="9026"/>
         </w:tabs>
-        <w:spacing w:after="0" w:before="138"/>
+        <w:spacing w:after="0" w:before="103"/>
       </w:pPr>
       <w:r>
         <w:rPr>
@@ -210,7 +224,7 @@
     </w:p>
     <w:p>
       <w:pPr>
-        <w:spacing w:after="49" w:before="0"/>
+        <w:spacing w:after="32" w:before="0"/>
         <w:ind w:left="160"/>
       </w:pPr>
       <w:r>
@@ -224,7 +238,7 @@
     </w:p>
     <w:p>
       <w:pPr>
-        <w:spacing w:after="49" w:before="0"/>
+        <w:spacing w:after="32" w:before="0"/>
         <w:ind w:left="160"/>
       </w:pPr>
       <w:r>
@@ -241,7 +255,7 @@
         <w:tabs>
           <w:tab w:val="right" w:pos="9026"/>
         </w:tabs>
-        <w:spacing w:after="0" w:before="138"/>
+        <w:spacing w:after="0" w:before="103"/>
       </w:pPr>
       <w:r>
         <w:rPr>
@@ -281,7 +295,7 @@
     </w:p>
     <w:p>
       <w:pPr>
-        <w:spacing w:after="49" w:before="0"/>
+        <w:spacing w:after="32" w:before="0"/>
         <w:ind w:left="160"/>
       </w:pPr>
       <w:r>
@@ -295,7 +309,7 @@
     </w:p>
     <w:p>
       <w:pPr>
-        <w:spacing w:after="49" w:before="0"/>
+        <w:spacing w:after="32" w:before="0"/>
         <w:ind w:left="160"/>
       </w:pPr>
       <w:r>
@@ -312,7 +326,7 @@
         <w:tabs>
           <w:tab w:val="right" w:pos="9026"/>
         </w:tabs>
-        <w:spacing w:after="0" w:before="138"/>
+        <w:spacing w:after="0" w:before="103"/>
       </w:pPr>
       <w:r>
         <w:rPr>
@@ -352,7 +366,7 @@
     </w:p>
     <w:p>
       <w:pPr>
-        <w:spacing w:after="49" w:before="0"/>
+        <w:spacing w:after="32" w:before="0"/>
         <w:ind w:left="160"/>
       </w:pPr>
       <w:r>
@@ -366,7 +380,7 @@
     </w:p>
     <w:p>
       <w:pPr>
-        <w:spacing w:after="49" w:before="0"/>
+        <w:spacing w:after="32" w:before="0"/>
         <w:ind w:left="160"/>
       </w:pPr>
       <w:r>
@@ -383,7 +397,7 @@
         <w:tabs>
           <w:tab w:val="right" w:pos="9026"/>
         </w:tabs>
-        <w:spacing w:after="0" w:before="138"/>
+        <w:spacing w:after="0" w:before="103"/>
       </w:pPr>
       <w:r>
         <w:rPr>
@@ -423,7 +437,7 @@
     </w:p>
     <w:p>
       <w:pPr>
-        <w:spacing w:after="49" w:before="0"/>
+        <w:spacing w:after="32" w:before="0"/>
         <w:ind w:left="160"/>
       </w:pPr>
       <w:r>
@@ -440,7 +454,7 @@
         <w:pBdr>
           <w:bottom w:val="single" w:color="000000" w:sz="6" w:space="2"/>
         </w:pBdr>
-        <w:spacing w:after="60" w:before="217"/>
+        <w:spacing w:after="60" w:before="165"/>
       </w:pPr>
       <w:r>
         <w:rPr>
@@ -455,7 +469,7 @@
     </w:p>
     <w:p>
       <w:pPr>
-        <w:spacing w:after="49" w:before="0"/>
+        <w:spacing w:after="32" w:before="0"/>
       </w:pPr>
       <w:r>
         <w:rPr>
@@ -478,7 +492,7 @@
     </w:p>
     <w:p>
       <w:pPr>
-        <w:spacing w:after="49" w:before="0"/>
+        <w:spacing w:after="32" w:before="0"/>
       </w:pPr>
       <w:r>
         <w:rPr>
@@ -501,7 +515,7 @@
     </w:p>
     <w:p>
       <w:pPr>
-        <w:spacing w:after="49" w:before="0"/>
+        <w:spacing w:after="32" w:before="0"/>
       </w:pPr>
       <w:r>
         <w:rPr>
@@ -524,7 +538,7 @@
     </w:p>
     <w:p>
       <w:pPr>
-        <w:spacing w:after="49" w:before="0"/>
+        <w:spacing w:after="32" w:before="0"/>
       </w:pPr>
       <w:r>
         <w:rPr>
@@ -550,7 +564,7 @@
         <w:pBdr>
           <w:bottom w:val="single" w:color="000000" w:sz="6" w:space="2"/>
         </w:pBdr>
-        <w:spacing w:after="60" w:before="217"/>
+        <w:spacing w:after="60" w:before="165"/>
       </w:pPr>
       <w:r>
         <w:rPr>
@@ -568,7 +582,7 @@
         <w:tabs>
           <w:tab w:val="right" w:pos="9026"/>
         </w:tabs>
-        <w:spacing w:after="0" w:before="138"/>
+        <w:spacing w:after="0" w:before="103"/>
       </w:pPr>
       <w:r>
         <w:rPr>

</xml_diff>

<commit_message>
Drop website link and LangChain, add ADESIS experience
Co-Authored-By: Claude Opus 5.5 (1M context) <noreply@anthropic.com>
</commit_message>
<xml_diff>
--- a/artifacts/resume/public/fernando-rodriguez-resume.docx
+++ b/artifacts/resume/public/fernando-rodriguez-resume.docx
@@ -26,8 +26,8 @@
       <w:r>
         <w:rPr>
           <w:rFonts w:ascii="Calibri" w:cs="Calibri" w:eastAsia="Calibri" w:hAnsi="Calibri"/>
-          <w:sz w:val="21"/>
-          <w:szCs w:val="21"/>
+          <w:sz w:val="20"/>
+          <w:szCs w:val="20"/>
         </w:rPr>
         <w:t xml:space="preserve">CTO @ Adhara  |  Backend Expert (Go / Java / JS)  |  Blockchain &amp; AI</w:t>
       </w:r>
@@ -46,18 +46,18 @@
           <w:sz w:val="18"/>
           <w:szCs w:val="18"/>
         </w:rPr>
-        <w:t xml:space="preserve">Madrid, Spain   |   thenanox@gmail.com   |   linkedin.com/in/fernando-rodriguez-garcia   |   thenanox.me</w:t>
-      </w:r>
-    </w:p>
-    <w:p>
-      <w:pPr>
-        <w:spacing w:after="165"/>
-      </w:pPr>
-      <w:r>
-        <w:rPr>
-          <w:rFonts w:ascii="Calibri" w:cs="Calibri" w:eastAsia="Calibri" w:hAnsi="Calibri"/>
-          <w:sz w:val="20"/>
-          <w:szCs w:val="20"/>
+        <w:t xml:space="preserve">Madrid, Spain   |   thenanox@gmail.com   |   linkedin.com/in/fernando-rodriguez-garcia</w:t>
+      </w:r>
+    </w:p>
+    <w:p>
+      <w:pPr>
+        <w:spacing w:after="140"/>
+      </w:pPr>
+      <w:r>
+        <w:rPr>
+          <w:rFonts w:ascii="Calibri" w:cs="Calibri" w:eastAsia="Calibri" w:hAnsi="Calibri"/>
+          <w:sz w:val="19"/>
+          <w:szCs w:val="19"/>
         </w:rPr>
         <w:t xml:space="preserve">Engineering leader with 15+ years building scalable distributed systems, blockchain platforms, and AI-driven products in fintech and regulated markets. CTO at Adhara, co-owning technology vision and execution for digital money and settlement infrastructure for central banks and financial institutions, while driving the company's AI strategy from experimentation to production.</w:t>
       </w:r>
@@ -67,7 +67,7 @@
         <w:pBdr>
           <w:bottom w:val="single" w:color="000000" w:sz="6" w:space="2"/>
         </w:pBdr>
-        <w:spacing w:after="60" w:before="165"/>
+        <w:spacing w:after="60" w:before="140"/>
       </w:pPr>
       <w:r>
         <w:rPr>
@@ -85,15 +85,15 @@
         <w:tabs>
           <w:tab w:val="right" w:pos="9026"/>
         </w:tabs>
-        <w:spacing w:after="0" w:before="103"/>
-      </w:pPr>
-      <w:r>
-        <w:rPr>
-          <w:rFonts w:ascii="Calibri" w:cs="Calibri" w:eastAsia="Calibri" w:hAnsi="Calibri"/>
-          <w:b/>
-          <w:bCs/>
-          <w:sz w:val="20"/>
-          <w:szCs w:val="20"/>
+        <w:spacing w:after="0" w:before="80"/>
+      </w:pPr>
+      <w:r>
+        <w:rPr>
+          <w:rFonts w:ascii="Calibri" w:cs="Calibri" w:eastAsia="Calibri" w:hAnsi="Calibri"/>
+          <w:b/>
+          <w:bCs/>
+          <w:sz w:val="19"/>
+          <w:szCs w:val="19"/>
         </w:rPr>
         <w:t xml:space="preserve">CTO</w:t>
       </w:r>
@@ -102,8 +102,8 @@
           <w:rFonts w:ascii="Calibri" w:cs="Calibri" w:eastAsia="Calibri" w:hAnsi="Calibri"/>
           <w:b/>
           <w:bCs/>
-          <w:sz w:val="20"/>
-          <w:szCs w:val="20"/>
+          <w:sz w:val="19"/>
+          <w:szCs w:val="19"/>
         </w:rPr>
         <w:t xml:space="preserve">	Jan 2026 – Present</w:t>
       </w:r>
@@ -117,64 +117,64 @@
           <w:rFonts w:ascii="Calibri" w:cs="Calibri" w:eastAsia="Calibri" w:hAnsi="Calibri"/>
           <w:i/>
           <w:iCs/>
-          <w:sz w:val="19"/>
-          <w:szCs w:val="19"/>
+          <w:sz w:val="18"/>
+          <w:szCs w:val="18"/>
         </w:rPr>
         <w:t xml:space="preserve">Adhara  ·  Madrid, Spain</w:t>
       </w:r>
     </w:p>
     <w:p>
       <w:pPr>
-        <w:spacing w:after="32" w:before="0"/>
-        <w:ind w:left="160"/>
-      </w:pPr>
-      <w:r>
-        <w:rPr>
-          <w:rFonts w:ascii="Calibri" w:cs="Calibri" w:eastAsia="Calibri" w:hAnsi="Calibri"/>
-          <w:sz w:val="20"/>
-          <w:szCs w:val="20"/>
+        <w:spacing w:after="20" w:before="0"/>
+        <w:ind w:left="160"/>
+      </w:pPr>
+      <w:r>
+        <w:rPr>
+          <w:rFonts w:ascii="Calibri" w:cs="Calibri" w:eastAsia="Calibri" w:hAnsi="Calibri"/>
+          <w:sz w:val="19"/>
+          <w:szCs w:val="19"/>
         </w:rPr>
         <w:t xml:space="preserve">• Co-own company-wide technology strategy and lead the engineering organization, from platform architecture and product engineering to delivery in highly regulated financial environments.</w:t>
       </w:r>
     </w:p>
     <w:p>
       <w:pPr>
-        <w:spacing w:after="32" w:before="0"/>
-        <w:ind w:left="160"/>
-      </w:pPr>
-      <w:r>
-        <w:rPr>
-          <w:rFonts w:ascii="Calibri" w:cs="Calibri" w:eastAsia="Calibri" w:hAnsi="Calibri"/>
-          <w:sz w:val="20"/>
-          <w:szCs w:val="20"/>
+        <w:spacing w:after="20" w:before="0"/>
+        <w:ind w:left="160"/>
+      </w:pPr>
+      <w:r>
+        <w:rPr>
+          <w:rFonts w:ascii="Calibri" w:cs="Calibri" w:eastAsia="Calibri" w:hAnsi="Calibri"/>
+          <w:sz w:val="19"/>
+          <w:szCs w:val="19"/>
         </w:rPr>
         <w:t xml:space="preserve">• Drive Adhara's AI strategy: embedding AI across engineering and shipping AI-enabled capabilities from experimentation to production-grade systems.</w:t>
       </w:r>
     </w:p>
     <w:p>
       <w:pPr>
-        <w:spacing w:after="32" w:before="0"/>
-        <w:ind w:left="160"/>
-      </w:pPr>
-      <w:r>
-        <w:rPr>
-          <w:rFonts w:ascii="Calibri" w:cs="Calibri" w:eastAsia="Calibri" w:hAnsi="Calibri"/>
-          <w:sz w:val="20"/>
-          <w:szCs w:val="20"/>
+        <w:spacing w:after="20" w:before="0"/>
+        <w:ind w:left="160"/>
+      </w:pPr>
+      <w:r>
+        <w:rPr>
+          <w:rFonts w:ascii="Calibri" w:cs="Calibri" w:eastAsia="Calibri" w:hAnsi="Calibri"/>
+          <w:sz w:val="19"/>
+          <w:szCs w:val="19"/>
         </w:rPr>
         <w:t xml:space="preserve">• Lead the modernization of the core platform for scalable, resilient, and secure settlement and tokenized money infrastructure; stay hands-on in architecture, Go backends, and Ethereum/DLT design.</w:t>
       </w:r>
     </w:p>
     <w:p>
       <w:pPr>
-        <w:spacing w:after="32" w:before="0"/>
-        <w:ind w:left="160"/>
-      </w:pPr>
-      <w:r>
-        <w:rPr>
-          <w:rFonts w:ascii="Calibri" w:cs="Calibri" w:eastAsia="Calibri" w:hAnsi="Calibri"/>
-          <w:sz w:val="20"/>
-          <w:szCs w:val="20"/>
+        <w:spacing w:after="20" w:before="0"/>
+        <w:ind w:left="160"/>
+      </w:pPr>
+      <w:r>
+        <w:rPr>
+          <w:rFonts w:ascii="Calibri" w:cs="Calibri" w:eastAsia="Calibri" w:hAnsi="Calibri"/>
+          <w:sz w:val="19"/>
+          <w:szCs w:val="19"/>
         </w:rPr>
         <w:t xml:space="preserve">• Own the technical narrative with customers, partners, and regulators (due diligence, security posture, architecture) and partner with the CEO and business leadership to align technology investment with strategy.</w:t>
       </w:r>
@@ -184,15 +184,15 @@
         <w:tabs>
           <w:tab w:val="right" w:pos="9026"/>
         </w:tabs>
-        <w:spacing w:after="0" w:before="103"/>
-      </w:pPr>
-      <w:r>
-        <w:rPr>
-          <w:rFonts w:ascii="Calibri" w:cs="Calibri" w:eastAsia="Calibri" w:hAnsi="Calibri"/>
-          <w:b/>
-          <w:bCs/>
-          <w:sz w:val="20"/>
-          <w:szCs w:val="20"/>
+        <w:spacing w:after="0" w:before="80"/>
+      </w:pPr>
+      <w:r>
+        <w:rPr>
+          <w:rFonts w:ascii="Calibri" w:cs="Calibri" w:eastAsia="Calibri" w:hAnsi="Calibri"/>
+          <w:b/>
+          <w:bCs/>
+          <w:sz w:val="19"/>
+          <w:szCs w:val="19"/>
         </w:rPr>
         <w:t xml:space="preserve">Principal Engineer (prev. Technical Lead)</w:t>
       </w:r>
@@ -201,8 +201,8 @@
           <w:rFonts w:ascii="Calibri" w:cs="Calibri" w:eastAsia="Calibri" w:hAnsi="Calibri"/>
           <w:b/>
           <w:bCs/>
-          <w:sz w:val="20"/>
-          <w:szCs w:val="20"/>
+          <w:sz w:val="19"/>
+          <w:szCs w:val="19"/>
         </w:rPr>
         <w:t xml:space="preserve">	May 2019 – Feb 2026</w:t>
       </w:r>
@@ -216,36 +216,36 @@
           <w:rFonts w:ascii="Calibri" w:cs="Calibri" w:eastAsia="Calibri" w:hAnsi="Calibri"/>
           <w:i/>
           <w:iCs/>
-          <w:sz w:val="19"/>
-          <w:szCs w:val="19"/>
+          <w:sz w:val="18"/>
+          <w:szCs w:val="18"/>
         </w:rPr>
         <w:t xml:space="preserve">Adhara  ·  Madrid, Spain</w:t>
       </w:r>
     </w:p>
     <w:p>
       <w:pPr>
-        <w:spacing w:after="32" w:before="0"/>
-        <w:ind w:left="160"/>
-      </w:pPr>
-      <w:r>
-        <w:rPr>
-          <w:rFonts w:ascii="Calibri" w:cs="Calibri" w:eastAsia="Calibri" w:hAnsi="Calibri"/>
-          <w:sz w:val="20"/>
-          <w:szCs w:val="20"/>
+        <w:spacing w:after="20" w:before="0"/>
+        <w:ind w:left="160"/>
+      </w:pPr>
+      <w:r>
+        <w:rPr>
+          <w:rFonts w:ascii="Calibri" w:cs="Calibri" w:eastAsia="Calibri" w:hAnsi="Calibri"/>
+          <w:sz w:val="19"/>
+          <w:szCs w:val="19"/>
         </w:rPr>
         <w:t xml:space="preserve">• Architected next-generation Ethereum and deposit token platforms enabling real-time, multi-currency settlement and cross-border payments for regulated financial markets.</w:t>
       </w:r>
     </w:p>
     <w:p>
       <w:pPr>
-        <w:spacing w:after="32" w:before="0"/>
-        <w:ind w:left="160"/>
-      </w:pPr>
-      <w:r>
-        <w:rPr>
-          <w:rFonts w:ascii="Calibri" w:cs="Calibri" w:eastAsia="Calibri" w:hAnsi="Calibri"/>
-          <w:sz w:val="20"/>
-          <w:szCs w:val="20"/>
+        <w:spacing w:after="20" w:before="0"/>
+        <w:ind w:left="160"/>
+      </w:pPr>
+      <w:r>
+        <w:rPr>
+          <w:rFonts w:ascii="Calibri" w:cs="Calibri" w:eastAsia="Calibri" w:hAnsi="Calibri"/>
+          <w:sz w:val="19"/>
+          <w:szCs w:val="19"/>
         </w:rPr>
         <w:t xml:space="preserve">• Led cross-functional engineering teams across Spain and South Africa, ensuring scalability, resilience, and security of production-grade DLT software.</w:t>
       </w:r>
@@ -255,15 +255,15 @@
         <w:tabs>
           <w:tab w:val="right" w:pos="9026"/>
         </w:tabs>
-        <w:spacing w:after="0" w:before="103"/>
-      </w:pPr>
-      <w:r>
-        <w:rPr>
-          <w:rFonts w:ascii="Calibri" w:cs="Calibri" w:eastAsia="Calibri" w:hAnsi="Calibri"/>
-          <w:b/>
-          <w:bCs/>
-          <w:sz w:val="20"/>
-          <w:szCs w:val="20"/>
+        <w:spacing w:after="0" w:before="80"/>
+      </w:pPr>
+      <w:r>
+        <w:rPr>
+          <w:rFonts w:ascii="Calibri" w:cs="Calibri" w:eastAsia="Calibri" w:hAnsi="Calibri"/>
+          <w:b/>
+          <w:bCs/>
+          <w:sz w:val="19"/>
+          <w:szCs w:val="19"/>
         </w:rPr>
         <w:t xml:space="preserve">Co-founder &amp; CTO</w:t>
       </w:r>
@@ -272,8 +272,8 @@
           <w:rFonts w:ascii="Calibri" w:cs="Calibri" w:eastAsia="Calibri" w:hAnsi="Calibri"/>
           <w:b/>
           <w:bCs/>
-          <w:sz w:val="20"/>
-          <w:szCs w:val="20"/>
+          <w:sz w:val="19"/>
+          <w:szCs w:val="19"/>
         </w:rPr>
         <w:t xml:space="preserve">	May 2019 – Present</w:t>
       </w:r>
@@ -287,36 +287,36 @@
           <w:rFonts w:ascii="Calibri" w:cs="Calibri" w:eastAsia="Calibri" w:hAnsi="Calibri"/>
           <w:i/>
           <w:iCs/>
-          <w:sz w:val="19"/>
-          <w:szCs w:val="19"/>
+          <w:sz w:val="18"/>
+          <w:szCs w:val="18"/>
         </w:rPr>
         <w:t xml:space="preserve">YONDR  ·  Madrid, Spain</w:t>
       </w:r>
     </w:p>
     <w:p>
       <w:pPr>
-        <w:spacing w:after="32" w:before="0"/>
-        <w:ind w:left="160"/>
-      </w:pPr>
-      <w:r>
-        <w:rPr>
-          <w:rFonts w:ascii="Calibri" w:cs="Calibri" w:eastAsia="Calibri" w:hAnsi="Calibri"/>
-          <w:sz w:val="20"/>
-          <w:szCs w:val="20"/>
+        <w:spacing w:after="20" w:before="0"/>
+        <w:ind w:left="160"/>
+      </w:pPr>
+      <w:r>
+        <w:rPr>
+          <w:rFonts w:ascii="Calibri" w:cs="Calibri" w:eastAsia="Calibri" w:hAnsi="Calibri"/>
+          <w:sz w:val="19"/>
+          <w:szCs w:val="19"/>
         </w:rPr>
         <w:t xml:space="preserve">• Architected scalable backend infrastructure and Android/iOS API layer for a mobile-first events platform, enabling seamless native integrations.</w:t>
       </w:r>
     </w:p>
     <w:p>
       <w:pPr>
-        <w:spacing w:after="32" w:before="0"/>
-        <w:ind w:left="160"/>
-      </w:pPr>
-      <w:r>
-        <w:rPr>
-          <w:rFonts w:ascii="Calibri" w:cs="Calibri" w:eastAsia="Calibri" w:hAnsi="Calibri"/>
-          <w:sz w:val="20"/>
-          <w:szCs w:val="20"/>
+        <w:spacing w:after="20" w:before="0"/>
+        <w:ind w:left="160"/>
+      </w:pPr>
+      <w:r>
+        <w:rPr>
+          <w:rFonts w:ascii="Calibri" w:cs="Calibri" w:eastAsia="Calibri" w:hAnsi="Calibri"/>
+          <w:sz w:val="19"/>
+          <w:szCs w:val="19"/>
         </w:rPr>
         <w:t xml:space="preserve">• Designed an asynchronous job distribution system in Java and RabbitMQ, dynamically scaling workers based on real-time load.</w:t>
       </w:r>
@@ -326,15 +326,15 @@
         <w:tabs>
           <w:tab w:val="right" w:pos="9026"/>
         </w:tabs>
-        <w:spacing w:after="0" w:before="103"/>
-      </w:pPr>
-      <w:r>
-        <w:rPr>
-          <w:rFonts w:ascii="Calibri" w:cs="Calibri" w:eastAsia="Calibri" w:hAnsi="Calibri"/>
-          <w:b/>
-          <w:bCs/>
-          <w:sz w:val="20"/>
-          <w:szCs w:val="20"/>
+        <w:spacing w:after="0" w:before="80"/>
+      </w:pPr>
+      <w:r>
+        <w:rPr>
+          <w:rFonts w:ascii="Calibri" w:cs="Calibri" w:eastAsia="Calibri" w:hAnsi="Calibri"/>
+          <w:b/>
+          <w:bCs/>
+          <w:sz w:val="19"/>
+          <w:szCs w:val="19"/>
         </w:rPr>
         <w:t xml:space="preserve">Head of Backend Development</w:t>
       </w:r>
@@ -343,8 +343,8 @@
           <w:rFonts w:ascii="Calibri" w:cs="Calibri" w:eastAsia="Calibri" w:hAnsi="Calibri"/>
           <w:b/>
           <w:bCs/>
-          <w:sz w:val="20"/>
-          <w:szCs w:val="20"/>
+          <w:sz w:val="19"/>
+          <w:szCs w:val="19"/>
         </w:rPr>
         <w:t xml:space="preserve">	Mar 2018 – May 2019</w:t>
       </w:r>
@@ -358,36 +358,36 @@
           <w:rFonts w:ascii="Calibri" w:cs="Calibri" w:eastAsia="Calibri" w:hAnsi="Calibri"/>
           <w:i/>
           <w:iCs/>
-          <w:sz w:val="19"/>
-          <w:szCs w:val="19"/>
+          <w:sz w:val="18"/>
+          <w:szCs w:val="18"/>
         </w:rPr>
         <w:t xml:space="preserve">Copado Solutions  ·  Madrid, Spain</w:t>
       </w:r>
     </w:p>
     <w:p>
       <w:pPr>
-        <w:spacing w:after="32" w:before="0"/>
-        <w:ind w:left="160"/>
-      </w:pPr>
-      <w:r>
-        <w:rPr>
-          <w:rFonts w:ascii="Calibri" w:cs="Calibri" w:eastAsia="Calibri" w:hAnsi="Calibri"/>
-          <w:sz w:val="20"/>
-          <w:szCs w:val="20"/>
+        <w:spacing w:after="20" w:before="0"/>
+        <w:ind w:left="160"/>
+      </w:pPr>
+      <w:r>
+        <w:rPr>
+          <w:rFonts w:ascii="Calibri" w:cs="Calibri" w:eastAsia="Calibri" w:hAnsi="Calibri"/>
+          <w:sz w:val="19"/>
+          <w:szCs w:val="19"/>
         </w:rPr>
         <w:t xml:space="preserve">• Led backend engineering integrating cloud infrastructure with Salesforce to automate CI/CD pipelines and release management for enterprise clients.</w:t>
       </w:r>
     </w:p>
     <w:p>
       <w:pPr>
-        <w:spacing w:after="32" w:before="0"/>
-        <w:ind w:left="160"/>
-      </w:pPr>
-      <w:r>
-        <w:rPr>
-          <w:rFonts w:ascii="Calibri" w:cs="Calibri" w:eastAsia="Calibri" w:hAnsi="Calibri"/>
-          <w:sz w:val="20"/>
-          <w:szCs w:val="20"/>
+        <w:spacing w:after="20" w:before="0"/>
+        <w:ind w:left="160"/>
+      </w:pPr>
+      <w:r>
+        <w:rPr>
+          <w:rFonts w:ascii="Calibri" w:cs="Calibri" w:eastAsia="Calibri" w:hAnsi="Calibri"/>
+          <w:sz w:val="19"/>
+          <w:szCs w:val="19"/>
         </w:rPr>
         <w:t xml:space="preserve">• Mentored a multidisciplinary backend team; drove adoption of automated testing, significantly reducing deployment times and increasing release frequency.</w:t>
       </w:r>
@@ -397,15 +397,15 @@
         <w:tabs>
           <w:tab w:val="right" w:pos="9026"/>
         </w:tabs>
-        <w:spacing w:after="0" w:before="103"/>
-      </w:pPr>
-      <w:r>
-        <w:rPr>
-          <w:rFonts w:ascii="Calibri" w:cs="Calibri" w:eastAsia="Calibri" w:hAnsi="Calibri"/>
-          <w:b/>
-          <w:bCs/>
-          <w:sz w:val="20"/>
-          <w:szCs w:val="20"/>
+        <w:spacing w:after="0" w:before="80"/>
+      </w:pPr>
+      <w:r>
+        <w:rPr>
+          <w:rFonts w:ascii="Calibri" w:cs="Calibri" w:eastAsia="Calibri" w:hAnsi="Calibri"/>
+          <w:b/>
+          <w:bCs/>
+          <w:sz w:val="19"/>
+          <w:szCs w:val="19"/>
         </w:rPr>
         <w:t xml:space="preserve">Full Stack Engineer</w:t>
       </w:r>
@@ -414,8 +414,8 @@
           <w:rFonts w:ascii="Calibri" w:cs="Calibri" w:eastAsia="Calibri" w:hAnsi="Calibri"/>
           <w:b/>
           <w:bCs/>
-          <w:sz w:val="20"/>
-          <w:szCs w:val="20"/>
+          <w:sz w:val="19"/>
+          <w:szCs w:val="19"/>
         </w:rPr>
         <w:t xml:space="preserve">	Jan 2016 – Mar 2018</w:t>
       </w:r>
@@ -429,24 +429,81 @@
           <w:rFonts w:ascii="Calibri" w:cs="Calibri" w:eastAsia="Calibri" w:hAnsi="Calibri"/>
           <w:i/>
           <w:iCs/>
-          <w:sz w:val="19"/>
-          <w:szCs w:val="19"/>
+          <w:sz w:val="18"/>
+          <w:szCs w:val="18"/>
         </w:rPr>
         <w:t xml:space="preserve">Grupo GFT  ·  Madrid, Spain</w:t>
       </w:r>
     </w:p>
     <w:p>
       <w:pPr>
-        <w:spacing w:after="32" w:before="0"/>
-        <w:ind w:left="160"/>
-      </w:pPr>
-      <w:r>
-        <w:rPr>
-          <w:rFonts w:ascii="Calibri" w:cs="Calibri" w:eastAsia="Calibri" w:hAnsi="Calibri"/>
-          <w:sz w:val="20"/>
-          <w:szCs w:val="20"/>
+        <w:spacing w:after="20" w:before="0"/>
+        <w:ind w:left="160"/>
+      </w:pPr>
+      <w:r>
+        <w:rPr>
+          <w:rFonts w:ascii="Calibri" w:cs="Calibri" w:eastAsia="Calibri" w:hAnsi="Calibri"/>
+          <w:sz w:val="19"/>
+          <w:szCs w:val="19"/>
         </w:rPr>
         <w:t xml:space="preserve">• Developed PSD2-compliant open banking API platform for BBVA and Bankinter, enabling secure third-party integrations and regulatory compliance.</w:t>
+      </w:r>
+    </w:p>
+    <w:p>
+      <w:pPr>
+        <w:tabs>
+          <w:tab w:val="right" w:pos="9026"/>
+        </w:tabs>
+        <w:spacing w:after="0" w:before="80"/>
+      </w:pPr>
+      <w:r>
+        <w:rPr>
+          <w:rFonts w:ascii="Calibri" w:cs="Calibri" w:eastAsia="Calibri" w:hAnsi="Calibri"/>
+          <w:b/>
+          <w:bCs/>
+          <w:sz w:val="19"/>
+          <w:szCs w:val="19"/>
+        </w:rPr>
+        <w:t xml:space="preserve">Full Stack Architect</w:t>
+      </w:r>
+      <w:r>
+        <w:rPr>
+          <w:rFonts w:ascii="Calibri" w:cs="Calibri" w:eastAsia="Calibri" w:hAnsi="Calibri"/>
+          <w:b/>
+          <w:bCs/>
+          <w:sz w:val="19"/>
+          <w:szCs w:val="19"/>
+        </w:rPr>
+        <w:t xml:space="preserve">	Oct 2012 – Dec 2015</w:t>
+      </w:r>
+    </w:p>
+    <w:p>
+      <w:pPr>
+        <w:spacing w:after="20" w:before="0"/>
+      </w:pPr>
+      <w:r>
+        <w:rPr>
+          <w:rFonts w:ascii="Calibri" w:cs="Calibri" w:eastAsia="Calibri" w:hAnsi="Calibri"/>
+          <w:i/>
+          <w:iCs/>
+          <w:sz w:val="18"/>
+          <w:szCs w:val="18"/>
+        </w:rPr>
+        <w:t xml:space="preserve">ADESIS Netlife  ·  Madrid, Spain</w:t>
+      </w:r>
+    </w:p>
+    <w:p>
+      <w:pPr>
+        <w:spacing w:after="20" w:before="0"/>
+        <w:ind w:left="160"/>
+      </w:pPr>
+      <w:r>
+        <w:rPr>
+          <w:rFonts w:ascii="Calibri" w:cs="Calibri" w:eastAsia="Calibri" w:hAnsi="Calibri"/>
+          <w:sz w:val="19"/>
+          <w:szCs w:val="19"/>
+        </w:rPr>
+        <w:t xml:space="preserve">• Designed and implemented the GAIA backend architecture for Mapfre (Spring / Java / AngularJS).</w:t>
       </w:r>
     </w:p>
     <w:p>
@@ -454,7 +511,7 @@
         <w:pBdr>
           <w:bottom w:val="single" w:color="000000" w:sz="6" w:space="2"/>
         </w:pBdr>
-        <w:spacing w:after="60" w:before="165"/>
+        <w:spacing w:after="60" w:before="140"/>
       </w:pPr>
       <w:r>
         <w:rPr>
@@ -469,92 +526,92 @@
     </w:p>
     <w:p>
       <w:pPr>
-        <w:spacing w:after="32" w:before="0"/>
-      </w:pPr>
-      <w:r>
-        <w:rPr>
-          <w:rFonts w:ascii="Calibri" w:cs="Calibri" w:eastAsia="Calibri" w:hAnsi="Calibri"/>
-          <w:b/>
-          <w:bCs/>
-          <w:sz w:val="20"/>
-          <w:szCs w:val="20"/>
+        <w:spacing w:after="20" w:before="0"/>
+      </w:pPr>
+      <w:r>
+        <w:rPr>
+          <w:rFonts w:ascii="Calibri" w:cs="Calibri" w:eastAsia="Calibri" w:hAnsi="Calibri"/>
+          <w:b/>
+          <w:bCs/>
+          <w:sz w:val="19"/>
+          <w:szCs w:val="19"/>
         </w:rPr>
         <w:t xml:space="preserve">Languages: </w:t>
       </w:r>
       <w:r>
         <w:rPr>
           <w:rFonts w:ascii="Calibri" w:cs="Calibri" w:eastAsia="Calibri" w:hAnsi="Calibri"/>
-          <w:sz w:val="20"/>
-          <w:szCs w:val="20"/>
+          <w:sz w:val="19"/>
+          <w:szCs w:val="19"/>
         </w:rPr>
         <w:t xml:space="preserve">Go, Java, JavaScript, TypeScript, PHP</w:t>
       </w:r>
     </w:p>
     <w:p>
       <w:pPr>
-        <w:spacing w:after="32" w:before="0"/>
-      </w:pPr>
-      <w:r>
-        <w:rPr>
-          <w:rFonts w:ascii="Calibri" w:cs="Calibri" w:eastAsia="Calibri" w:hAnsi="Calibri"/>
-          <w:b/>
-          <w:bCs/>
-          <w:sz w:val="20"/>
-          <w:szCs w:val="20"/>
+        <w:spacing w:after="20" w:before="0"/>
+      </w:pPr>
+      <w:r>
+        <w:rPr>
+          <w:rFonts w:ascii="Calibri" w:cs="Calibri" w:eastAsia="Calibri" w:hAnsi="Calibri"/>
+          <w:b/>
+          <w:bCs/>
+          <w:sz w:val="19"/>
+          <w:szCs w:val="19"/>
         </w:rPr>
         <w:t xml:space="preserve">Blockchain &amp; Web3: </w:t>
       </w:r>
       <w:r>
         <w:rPr>
           <w:rFonts w:ascii="Calibri" w:cs="Calibri" w:eastAsia="Calibri" w:hAnsi="Calibri"/>
-          <w:sz w:val="20"/>
-          <w:szCs w:val="20"/>
+          <w:sz w:val="19"/>
+          <w:szCs w:val="19"/>
         </w:rPr>
         <w:t xml:space="preserve">Ethereum, Smart Contracts, DLT, Digital Tokens, Deposit Tokens</w:t>
       </w:r>
     </w:p>
     <w:p>
       <w:pPr>
-        <w:spacing w:after="32" w:before="0"/>
-      </w:pPr>
-      <w:r>
-        <w:rPr>
-          <w:rFonts w:ascii="Calibri" w:cs="Calibri" w:eastAsia="Calibri" w:hAnsi="Calibri"/>
-          <w:b/>
-          <w:bCs/>
-          <w:sz w:val="20"/>
-          <w:szCs w:val="20"/>
+        <w:spacing w:after="20" w:before="0"/>
+      </w:pPr>
+      <w:r>
+        <w:rPr>
+          <w:rFonts w:ascii="Calibri" w:cs="Calibri" w:eastAsia="Calibri" w:hAnsi="Calibri"/>
+          <w:b/>
+          <w:bCs/>
+          <w:sz w:val="19"/>
+          <w:szCs w:val="19"/>
         </w:rPr>
         <w:t xml:space="preserve">AI / ML: </w:t>
       </w:r>
       <w:r>
         <w:rPr>
           <w:rFonts w:ascii="Calibri" w:cs="Calibri" w:eastAsia="Calibri" w:hAnsi="Calibri"/>
-          <w:sz w:val="20"/>
-          <w:szCs w:val="20"/>
-        </w:rPr>
-        <w:t xml:space="preserve">LangChain, AI-driven platforms, Prompt Engineering</w:t>
-      </w:r>
-    </w:p>
-    <w:p>
-      <w:pPr>
-        <w:spacing w:after="32" w:before="0"/>
-      </w:pPr>
-      <w:r>
-        <w:rPr>
-          <w:rFonts w:ascii="Calibri" w:cs="Calibri" w:eastAsia="Calibri" w:hAnsi="Calibri"/>
-          <w:b/>
-          <w:bCs/>
-          <w:sz w:val="20"/>
-          <w:szCs w:val="20"/>
+          <w:sz w:val="19"/>
+          <w:szCs w:val="19"/>
+        </w:rPr>
+        <w:t xml:space="preserve">AI-driven platforms, Prompt Engineering</w:t>
+      </w:r>
+    </w:p>
+    <w:p>
+      <w:pPr>
+        <w:spacing w:after="20" w:before="0"/>
+      </w:pPr>
+      <w:r>
+        <w:rPr>
+          <w:rFonts w:ascii="Calibri" w:cs="Calibri" w:eastAsia="Calibri" w:hAnsi="Calibri"/>
+          <w:b/>
+          <w:bCs/>
+          <w:sz w:val="19"/>
+          <w:szCs w:val="19"/>
         </w:rPr>
         <w:t xml:space="preserve">Backend &amp; Infra: </w:t>
       </w:r>
       <w:r>
         <w:rPr>
           <w:rFonts w:ascii="Calibri" w:cs="Calibri" w:eastAsia="Calibri" w:hAnsi="Calibri"/>
-          <w:sz w:val="20"/>
-          <w:szCs w:val="20"/>
+          <w:sz w:val="19"/>
+          <w:szCs w:val="19"/>
         </w:rPr>
         <w:t xml:space="preserve">REST APIs, Distributed Systems, RabbitMQ, Spring, Microservices, Docker</w:t>
       </w:r>
@@ -564,7 +621,7 @@
         <w:pBdr>
           <w:bottom w:val="single" w:color="000000" w:sz="6" w:space="2"/>
         </w:pBdr>
-        <w:spacing w:after="60" w:before="165"/>
+        <w:spacing w:after="60" w:before="140"/>
       </w:pPr>
       <w:r>
         <w:rPr>
@@ -582,15 +639,15 @@
         <w:tabs>
           <w:tab w:val="right" w:pos="9026"/>
         </w:tabs>
-        <w:spacing w:after="0" w:before="103"/>
-      </w:pPr>
-      <w:r>
-        <w:rPr>
-          <w:rFonts w:ascii="Calibri" w:cs="Calibri" w:eastAsia="Calibri" w:hAnsi="Calibri"/>
-          <w:b/>
-          <w:bCs/>
-          <w:sz w:val="20"/>
-          <w:szCs w:val="20"/>
+        <w:spacing w:after="0" w:before="80"/>
+      </w:pPr>
+      <w:r>
+        <w:rPr>
+          <w:rFonts w:ascii="Calibri" w:cs="Calibri" w:eastAsia="Calibri" w:hAnsi="Calibri"/>
+          <w:b/>
+          <w:bCs/>
+          <w:sz w:val="19"/>
+          <w:szCs w:val="19"/>
         </w:rPr>
         <w:t xml:space="preserve">Ingeniero Informático Superior (M.Eng. equivalent), Computer Engineering</w:t>
       </w:r>
@@ -599,8 +656,8 @@
           <w:rFonts w:ascii="Calibri" w:cs="Calibri" w:eastAsia="Calibri" w:hAnsi="Calibri"/>
           <w:b/>
           <w:bCs/>
-          <w:sz w:val="20"/>
-          <w:szCs w:val="20"/>
+          <w:sz w:val="19"/>
+          <w:szCs w:val="19"/>
         </w:rPr>
         <w:t xml:space="preserve">	2005 – 2011</w:t>
       </w:r>
@@ -614,8 +671,8 @@
           <w:rFonts w:ascii="Calibri" w:cs="Calibri" w:eastAsia="Calibri" w:hAnsi="Calibri"/>
           <w:i/>
           <w:iCs/>
-          <w:sz w:val="19"/>
-          <w:szCs w:val="19"/>
+          <w:sz w:val="18"/>
+          <w:szCs w:val="18"/>
         </w:rPr>
         <w:t xml:space="preserve">Universidad de Murcia  ·  Murcia, Spain</w:t>
       </w:r>

</xml_diff>